<commit_message>
feat(publikasi): comment system, dashboard moderation, and Giphy SDK
</commit_message>
<xml_diff>
--- a/docs/Proposal_Inovasi_Arumanis.docx
+++ b/docs/Proposal_Inovasi_Arumanis.docx
@@ -226,8 +226,32 @@
         <w:rPr>
           <w:lang w:val="id-ID"/>
         </w:rPr>
-        <w:t xml:space="preserve">Halaman publikasi untuk video singkat tentang arumanis dan dokumen ini, bisa diakses di alamat: </w:t>
-      </w:r>
+        <w:t>Halaman publikasi untuk video singkat tentang arumanis dan dokumen ini, bisa diakses di alamat:</w:t>
+      </w:r>
+      <w:r>
+        <w:rPr>
+          <w:lang w:val="id-ID"/>
+        </w:rPr>
+        <w:t xml:space="preserve"> </w:t>
+      </w:r>
+      <w:hyperlink r:id="rId8" w:history="1">
+        <w:r>
+          <w:rPr>
+            <w:rStyle w:val="Hyperlink"/>
+            <w:lang w:val="id-ID"/>
+          </w:rPr>
+          <w:t>https://arumanis.cianjur.space/publikasi/arumanis-platform-untuk-monitoring-air-minum-sanitasi-H0cMH</w:t>
+        </w:r>
+      </w:hyperlink>
+    </w:p>
+    <w:p>
+      <w:pPr>
+        <w:spacing w:after="200" w:line="360" w:lineRule="auto"/>
+        <w:jc w:val="both"/>
+        <w:rPr>
+          <w:lang w:val="id-ID"/>
+        </w:rPr>
+      </w:pPr>
     </w:p>
     <w:p>
       <w:pPr>
@@ -308,7 +332,33 @@
         <w:rPr>
           <w:lang w:val="id-ID"/>
         </w:rPr>
-        <w:t xml:space="preserve">Arumanis (Air Minum dan Sanitasi) adalah platform monitoring pekerjaan konstruksi SPAM perdesaan dan sanitasi—khususnya pengelolaan air limbah—serta pengolahan data real-time di 33 kecamatan dan 365 desa Kabupaten Cianjur. Inti inovasi: memantau progress konstruksi, dokumentasi lapangan </w:t>
+        <w:t xml:space="preserve">Arumanis (Air Minum dan Sanitasi) adalah platform </w:t>
+      </w:r>
+      <w:r>
+        <w:rPr>
+          <w:i/>
+          <w:iCs/>
+          <w:lang w:val="id-ID"/>
+        </w:rPr>
+        <w:t>monitoring</w:t>
+      </w:r>
+      <w:r>
+        <w:rPr>
+          <w:lang w:val="id-ID"/>
+        </w:rPr>
+        <w:t xml:space="preserve"> pekerjaan konstruksi </w:t>
+      </w:r>
+      <w:r>
+        <w:rPr>
+          <w:lang w:val="id-ID"/>
+        </w:rPr>
+        <w:t xml:space="preserve">infrastruktur air minum atau lebih spesifik </w:t>
+      </w:r>
+      <w:r>
+        <w:rPr>
+          <w:lang w:val="id-ID"/>
+        </w:rPr>
+        <w:t xml:space="preserve">SPAM perdesaan dan sanitasi—khususnya pengelolaan air limbah—serta pengolahan data real-time di 33 kecamatan dan 365 desa Kabupaten Cianjur. Inti inovasi: memantau progress konstruksi, dokumentasi lapangan </w:t>
       </w:r>
       <w:r>
         <w:rPr>
@@ -477,7 +527,21 @@
         <w:rPr>
           <w:lang w:val="id-ID"/>
         </w:rPr>
-        <w:t>Inti inovasi Arumanis adalah platform pemantauan (monitoring) pelaksanaan pekerjaan konstruksi infrastruktur SPAM perdesaan serta pekerjaan sanitasi, khususnya pada bidang pengelolaan air limbah (SPALD-T, SPALD-S, IPLT, dan infrastruktur terkait). Pekerjaan-pekerjaan ini tersebar di 33 kecamatan dan 365 desa/kelurahan Kabupaten Cianjur, dengan pelaksana yang melibatkan dinas, pengawas lapangan, konsultan, kontraktor, dan pengelola desa.</w:t>
+        <w:t>Inti Arumanis adalah platform pemantauan (</w:t>
+      </w:r>
+      <w:r>
+        <w:rPr>
+          <w:i/>
+          <w:iCs/>
+          <w:lang w:val="id-ID"/>
+        </w:rPr>
+        <w:t>monitoring</w:t>
+      </w:r>
+      <w:r>
+        <w:rPr>
+          <w:lang w:val="id-ID"/>
+        </w:rPr>
+        <w:t>) pelaksanaan pekerjaan konstruksi infrastruktur SPAM perdesaan serta pekerjaan sanitasi, khususnya pada bidang pengelolaan air limbah (SPALD-T, SPALD-S, IPLT, dan infrastruktur terkait). Pekerjaan-pekerjaan ini tersebar di 33 kecamatan dan 365 desa/kelurahan Kabupaten Cianjur, dengan pelaksana yang melibatkan dinas, pengawas lapangan, konsultan, kontraktor, dan pengelola desa.</w:t>
       </w:r>
     </w:p>
     <w:p>
@@ -507,29 +571,67 @@
         <w:rPr>
           <w:lang w:val="id-ID"/>
         </w:rPr>
-        <w:t xml:space="preserve">Di luar fungsi monitoring konstruksi, Arumanis mengolah data secara real-time: dashboard, rekapitulasi capaian Standar Pelayanan Minimum (SPM), peta per desa, ekspor laporan, </w:t>
+        <w:t>Di luar fungsi monitoring konstruksi</w:t>
+      </w:r>
+      <w:r>
+        <w:rPr>
+          <w:lang w:val="id-ID"/>
+        </w:rPr>
+        <w:t xml:space="preserve"> infrastruktur</w:t>
+      </w:r>
+      <w:r>
+        <w:rPr>
+          <w:lang w:val="id-ID"/>
+        </w:rPr>
+        <w:t xml:space="preserve">, Arumanis mengolah data secara real-time: dashboard, rekapitulasi capaian Standar Pelayanan Minimum (SPM), peta per desa, ekspor </w:t>
       </w:r>
       <w:r>
         <w:rPr>
           <w:lang w:val="id-ID"/>
         </w:rPr>
         <w:lastRenderedPageBreak/>
-        <w:t>statistik pengawas, dan publikasi kepada masyarakat. Arumanis bukan sekadar repositori arsip, melainkan sistem kerja yang menghubungkan lapangan dan kantor pusat.</w:t>
-      </w:r>
-    </w:p>
-    <w:p>
-      <w:pPr>
-        <w:spacing w:after="200" w:line="360" w:lineRule="auto"/>
-        <w:jc w:val="both"/>
-        <w:rPr>
-          <w:lang w:val="id-ID"/>
-        </w:rPr>
-      </w:pPr>
-      <w:r>
-        <w:rPr>
-          <w:lang w:val="id-ID"/>
-        </w:rPr>
-        <w:t xml:space="preserve">Basis data masih dalam proses sinkronisasi dari berbagai sumber sejak 2017. Scan ulang menemukan jejak capaian SPAM </w:t>
+        <w:t>laporan, statistik pengawas, dan publikasi kepada masyarakat. Arumanis bukan sekadar repositori arsip, melainkan sistem kerja yang menghubungkan lapangan dan kantor pusat.</w:t>
+      </w:r>
+    </w:p>
+    <w:p>
+      <w:pPr>
+        <w:spacing w:after="200" w:line="360" w:lineRule="auto"/>
+        <w:jc w:val="both"/>
+        <w:rPr>
+          <w:lang w:val="id-ID"/>
+        </w:rPr>
+      </w:pPr>
+      <w:r>
+        <w:rPr>
+          <w:lang w:val="id-ID"/>
+        </w:rPr>
+        <w:t xml:space="preserve">Basis data masih dalam proses sinkronisasi dari berbagai sumber </w:t>
+      </w:r>
+      <w:r>
+        <w:rPr>
+          <w:lang w:val="id-ID"/>
+        </w:rPr>
+        <w:t>dari tahun</w:t>
+      </w:r>
+      <w:r>
+        <w:rPr>
+          <w:lang w:val="id-ID"/>
+        </w:rPr>
+        <w:t xml:space="preserve"> 2017. </w:t>
+      </w:r>
+      <w:r>
+        <w:rPr>
+          <w:i/>
+          <w:iCs/>
+          <w:lang w:val="id-ID"/>
+        </w:rPr>
+        <w:t>Scan</w:t>
+      </w:r>
+      <w:r>
+        <w:rPr>
+          <w:lang w:val="id-ID"/>
+        </w:rPr>
+        <w:t xml:space="preserve"> ulang menemukan jejak capaian SPAM </w:t>
       </w:r>
       <w:r>
         <w:rPr>
@@ -541,7 +643,33 @@
         <w:rPr>
           <w:lang w:val="id-ID"/>
         </w:rPr>
-        <w:t xml:space="preserve"> tahun 2009 dari impor arsip historis. Data dihimpun dari Excel/CSV, input operator, modul pekerjaan, capaian unit SPAM, dokumentasi Panel Pengawasan, dan sumber lain—belum seluruhnya harmonis. Catatan penting: seluruh angka dalam dokumen ini bersumber dari data yang telah dihimpun Arumanis dan masih dalam tahap sinkronisasi dari berbagai sumber. Proses harmonisasi belum selesai sepenuhnya sehingga dapat terdapat ketidaksesuaian, duplikasi, atau kesalahan data. Angka diposisikan sebagai gambaran kondisi terkini, bukan pernyataan final.</w:t>
+        <w:t xml:space="preserve"> tahun 2009 dari impor arsip historis. Data dihimpun dari </w:t>
+      </w:r>
+      <w:r>
+        <w:rPr>
+          <w:i/>
+          <w:iCs/>
+          <w:lang w:val="id-ID"/>
+        </w:rPr>
+        <w:t>Excel/CSV</w:t>
+      </w:r>
+      <w:r>
+        <w:rPr>
+          <w:lang w:val="id-ID"/>
+        </w:rPr>
+        <w:t xml:space="preserve">, input operator, modul pekerjaan, capaian unit SPAM, dokumentasi Panel Pengawasan, </w:t>
+      </w:r>
+      <w:r>
+        <w:rPr>
+          <w:lang w:val="id-ID"/>
+        </w:rPr>
+        <w:t xml:space="preserve">SPSE LKPP, </w:t>
+      </w:r>
+      <w:r>
+        <w:rPr>
+          <w:lang w:val="id-ID"/>
+        </w:rPr>
+        <w:t>dan sumber lain—belum seluruhnya harmonis. Catatan penting: seluruh angka dalam dokumen ini bersumber dari data yang telah dihimpun Arumanis dan masih dalam tahap sinkronisasi dari berbagai sumber. Proses harmonisasi belum selesai sepenuhnya sehingga dapat terdapat ketidaksesuaian, duplikasi, atau kesalahan data. Angka diposisikan sebagai gambaran kondisi terkini, bukan pernyataan final.</w:t>
       </w:r>
     </w:p>
     <w:p>
@@ -571,7 +699,19 @@
         <w:rPr>
           <w:lang w:val="id-ID"/>
         </w:rPr>
-        <w:t>Inventaris terkumpul: 558 pekerjaan konstruksi (kumulatif), 466 kontrak; 364 unit SPAM (33 SIMSPAM); 162 infrastruktur sanitasi (56 SPALD-T, 105 SPALD-S, 1 IPLT) di 104 desa; 508 record capaian tahunan; 6.168 foto dokumentasi.</w:t>
+        <w:t>Inventaris</w:t>
+      </w:r>
+      <w:r>
+        <w:rPr>
+          <w:lang w:val="id-ID"/>
+        </w:rPr>
+        <w:t xml:space="preserve"> infrastruktur</w:t>
+      </w:r>
+      <w:r>
+        <w:rPr>
+          <w:lang w:val="id-ID"/>
+        </w:rPr>
+        <w:t xml:space="preserve"> terkumpul: 558 pekerjaan konstruksi (kumulatif), 466 kontrak; 364 unit SPAM (33 SIMSPAM); 162 infrastruktur sanitasi (56 SPALD-T, 105 SPALD-S, 1 IPLT) di 104 desa; 508 record capaian tahunan; 6.168 foto dokumentasi.</w:t>
       </w:r>
     </w:p>
     <w:p>
@@ -601,7 +741,33 @@
         <w:rPr>
           <w:lang w:val="id-ID"/>
         </w:rPr>
-        <w:t xml:space="preserve">Peta anggaran terhimpun (snapshot, dapat berubah saat sinkronisasi): air minum—nilai kontrak/unit SPAM </w:t>
+        <w:t>Peta anggaran terhimpun (</w:t>
+      </w:r>
+      <w:r>
+        <w:rPr>
+          <w:i/>
+          <w:iCs/>
+          <w:lang w:val="id-ID"/>
+        </w:rPr>
+        <w:t>snapshot</w:t>
+      </w:r>
+      <w:r>
+        <w:rPr>
+          <w:lang w:val="id-ID"/>
+        </w:rPr>
+        <w:t>, dapat berubah saat sinkronisasi</w:t>
+      </w:r>
+      <w:r>
+        <w:rPr>
+          <w:lang w:val="id-ID"/>
+        </w:rPr>
+        <w:t xml:space="preserve"> dan harmonisasi data</w:t>
+      </w:r>
+      <w:r>
+        <w:rPr>
+          <w:lang w:val="id-ID"/>
+        </w:rPr>
+        <w:t xml:space="preserve">): air minum—nilai kontrak/unit SPAM </w:t>
       </w:r>
       <w:r>
         <w:rPr>
@@ -784,14 +950,42 @@
         <w:rPr>
           <w:lang w:val="id-ID"/>
         </w:rPr>
-        <w:t xml:space="preserve"> capaian, 1 unit, 215 KK / 1.075 jiwa); tahun 2020 (63 record capaian, 63 unit, 13.125 KK / 65.607 jiwa); tahun 2021 (59 record capaian, 59 unit, 10.696 KK / 53.433 jiwa); tahun 2022 (61 record capaian, 61 unit, 10.312 KK / 51.546 </w:t>
+        <w:t xml:space="preserve"> capaian, 1 unit, 215 KK / 1.075 jiwa); tahun 2020 (63 record capaian, 63 unit, 13.125 KK / 65.607 jiwa); tahun 2021 (59 </w:t>
+      </w:r>
+      <w:r>
+        <w:rPr>
+          <w:i/>
+          <w:iCs/>
+          <w:lang w:val="id-ID"/>
+        </w:rPr>
+        <w:t>record</w:t>
+      </w:r>
+      <w:r>
+        <w:rPr>
+          <w:lang w:val="id-ID"/>
+        </w:rPr>
+        <w:t xml:space="preserve"> capaian, 59 unit, 10.696 KK / 53.433 jiwa); tahun 2022 (61 </w:t>
+      </w:r>
+      <w:r>
+        <w:rPr>
+          <w:i/>
+          <w:iCs/>
+          <w:lang w:val="id-ID"/>
+        </w:rPr>
+        <w:t>record</w:t>
+      </w:r>
+      <w:r>
+        <w:rPr>
+          <w:lang w:val="id-ID"/>
+        </w:rPr>
+        <w:t xml:space="preserve"> capaian, 61 unit, 10.312 KK / 51.546 </w:t>
       </w:r>
       <w:r>
         <w:rPr>
           <w:lang w:val="id-ID"/>
         </w:rPr>
         <w:lastRenderedPageBreak/>
-        <w:t xml:space="preserve">jiwa); tahun 2023 (55 record capaian, 55 unit, 5.920 KK / 29.601 jiwa); tahun 2024 (192 record capaian, 192 unit, 5.093 KK / 25.479 jiwa); tahun 2025 (71 </w:t>
+        <w:t xml:space="preserve">jiwa); tahun 2023 (55 </w:t>
       </w:r>
       <w:r>
         <w:rPr>
@@ -805,7 +999,35 @@
         <w:rPr>
           <w:lang w:val="id-ID"/>
         </w:rPr>
-        <w:t xml:space="preserve"> capaian, 71 unit, 7.552 KK / 37.828 jiwa); tahun 2026 (5 record capaian, 5 unit, 75 KK / 363 jiwa). Rekaman ini mencerminkan perkembangan pelaporan capaian layanan dari unit-unit SPAM perdesaan lintas periode, bukan sekadar data tahun berjalan.</w:t>
+        <w:t xml:space="preserve"> capaian, 55 unit, 5.920 KK / 29.601 jiwa); tahun 2024 (192 record capaian, 192 unit, 5.093 KK / 25.479 jiwa); tahun 2025 (71 </w:t>
+      </w:r>
+      <w:r>
+        <w:rPr>
+          <w:i/>
+          <w:iCs/>
+          <w:lang w:val="id-ID"/>
+        </w:rPr>
+        <w:t>record</w:t>
+      </w:r>
+      <w:r>
+        <w:rPr>
+          <w:lang w:val="id-ID"/>
+        </w:rPr>
+        <w:t xml:space="preserve"> capaian, 71 unit, 7.552 KK / 37.828 jiwa); tahun 2026 (5 </w:t>
+      </w:r>
+      <w:r>
+        <w:rPr>
+          <w:i/>
+          <w:iCs/>
+          <w:lang w:val="id-ID"/>
+        </w:rPr>
+        <w:t>record</w:t>
+      </w:r>
+      <w:r>
+        <w:rPr>
+          <w:lang w:val="id-ID"/>
+        </w:rPr>
+        <w:t xml:space="preserve"> capaian, 5 unit, 75 KK / 363 jiwa). Rekaman ini mencerminkan perkembangan pelaporan capaian layanan dari unit-unit SPAM perdesaan lintas periode, bukan sekadar data tahun berjalan.</w:t>
       </w:r>
     </w:p>
     <w:p>
@@ -1105,7 +1327,19 @@
           <w:lang w:val="id-ID"/>
         </w:rPr>
         <w:lastRenderedPageBreak/>
-        <w:t>Monitoring proyek: sebelumnya tidak terstandar per berkas; sesudahnya 558 paket pekerjaan terpantau. Interval laporan pengawas: dari 2–4 minggu menjadi</w:t>
+        <w:t xml:space="preserve">Monitoring </w:t>
+      </w:r>
+      <w:r>
+        <w:rPr>
+          <w:lang w:val="id-ID"/>
+        </w:rPr>
+        <w:t>infrastruktur</w:t>
+      </w:r>
+      <w:r>
+        <w:rPr>
+          <w:lang w:val="id-ID"/>
+        </w:rPr>
+        <w:t>: sebelumnya tidak terstandar per berkas; sesudahnya 558 paket pekerjaan terpantau. Interval laporan pengawas: dari 2–4 minggu menjadi</w:t>
       </w:r>
       <w:r>
         <w:rPr>
@@ -1355,7 +1589,19 @@
         <w:rPr>
           <w:lang w:val="id-ID"/>
         </w:rPr>
-        <w:t xml:space="preserve">Setelah inovasi, 162 infrastruktur sanitasi terdata dengan 104 desa memiliki infrastruktur terpetakan. Capaian pemanfaat mencapai 9.645 KK dan 48.225 jiwa, dengan nilai investasi terkonsolidasi </w:t>
+        <w:t xml:space="preserve">Setelah </w:t>
+      </w:r>
+      <w:r>
+        <w:rPr>
+          <w:lang w:val="id-ID"/>
+        </w:rPr>
+        <w:t>Arumanis</w:t>
+      </w:r>
+      <w:r>
+        <w:rPr>
+          <w:lang w:val="id-ID"/>
+        </w:rPr>
+        <w:t xml:space="preserve">, 162 infrastruktur sanitasi terdata dengan 104 desa memiliki infrastruktur terpetakan. Capaian pemanfaat mencapai 9.645 KK dan 48.225 jiwa, dengan nilai investasi terkonsolidasi </w:t>
       </w:r>
       <w:r>
         <w:rPr>
@@ -1392,22 +1638,64 @@
           <w:lang w:val="id-ID"/>
         </w:rPr>
         <w:lastRenderedPageBreak/>
-        <w:t>Pengolahan Data Real-Time untuk Keperluan Operasional</w:t>
-      </w:r>
-    </w:p>
-    <w:p>
-      <w:pPr>
-        <w:spacing w:after="200" w:line="360" w:lineRule="auto"/>
-        <w:jc w:val="both"/>
-        <w:rPr>
-          <w:lang w:val="id-ID"/>
-        </w:rPr>
-      </w:pPr>
-      <w:r>
-        <w:rPr>
-          <w:lang w:val="id-ID"/>
-        </w:rPr>
-        <w:t xml:space="preserve">Keunggulan pembaharuan berikutnya adalah kemampuan Arumanis mengolah data secara real-time sesuai kebutuhan pengguna. Dashboard menampilkan ringkasan kegiatan, pekerjaan, kontrak, output, pagu, distribusi sumber dana (DAK, APBD, DAU, PAD), dan indikator kualitas data tanpa menunggu rekapitulasi manual. Asisten Ami AI membantu penafsiran data operasional; laporan </w:t>
+        <w:t xml:space="preserve">Pengolahan Data </w:t>
+      </w:r>
+      <w:r>
+        <w:rPr>
+          <w:i/>
+          <w:iCs/>
+          <w:lang w:val="id-ID"/>
+        </w:rPr>
+        <w:t>Real-Time</w:t>
+      </w:r>
+      <w:r>
+        <w:rPr>
+          <w:lang w:val="id-ID"/>
+        </w:rPr>
+        <w:t xml:space="preserve"> untuk Keperluan Operasional</w:t>
+      </w:r>
+    </w:p>
+    <w:p>
+      <w:pPr>
+        <w:spacing w:after="200" w:line="360" w:lineRule="auto"/>
+        <w:jc w:val="both"/>
+        <w:rPr>
+          <w:lang w:val="id-ID"/>
+        </w:rPr>
+      </w:pPr>
+      <w:r>
+        <w:rPr>
+          <w:lang w:val="id-ID"/>
+        </w:rPr>
+        <w:t xml:space="preserve">Keunggulan pembaharuan berikutnya adalah kemampuan Arumanis mengolah data secara </w:t>
+      </w:r>
+      <w:r>
+        <w:rPr>
+          <w:i/>
+          <w:iCs/>
+          <w:lang w:val="id-ID"/>
+        </w:rPr>
+        <w:t>real-time</w:t>
+      </w:r>
+      <w:r>
+        <w:rPr>
+          <w:lang w:val="id-ID"/>
+        </w:rPr>
+        <w:t xml:space="preserve"> sesuai kebutuhan pengguna. </w:t>
+      </w:r>
+      <w:r>
+        <w:rPr>
+          <w:i/>
+          <w:iCs/>
+          <w:lang w:val="id-ID"/>
+        </w:rPr>
+        <w:t>Dashboard</w:t>
+      </w:r>
+      <w:r>
+        <w:rPr>
+          <w:lang w:val="id-ID"/>
+        </w:rPr>
+        <w:t xml:space="preserve"> menampilkan ringkasan kegiatan, pekerjaan, kontrak, output, pagu, distribusi sumber dana (DAK, APBD, DAU, PAD), dan indikator kualitas data tanpa menunggu rekapitulasi manual. Asisten Ami AI membantu penafsiran data operasional; laporan </w:t>
       </w:r>
       <w:r>
         <w:rPr>
@@ -1515,7 +1803,21 @@
         <w:rPr>
           <w:lang w:val="id-ID"/>
         </w:rPr>
-        <w:t>Hingga snapshot ini, 508 record capaian SPAM dan data pekerjaan aktif telah terhimpun. Capaian Standar Pelayanan Minimum (SPM) air minum 13,24% dan sanitasi 1,90% akan terus diperbarui seiring sinkronisasi. Catatan penting: seluruh angka dalam dokumen ini bersumber dari data yang telah dihimpun Arumanis dan masih dalam tahap sinkronisasi dari berbagai sumber. Proses harmonisasi belum selesai sepenuhnya sehingga dapat terdapat ketidaksesuaian, duplikasi, atau kesalahan data. Angka diposisikan sebagai gambaran kondisi terkini, bukan pernyataan final.</w:t>
+        <w:t xml:space="preserve">Hingga </w:t>
+      </w:r>
+      <w:r>
+        <w:rPr>
+          <w:i/>
+          <w:iCs/>
+          <w:lang w:val="id-ID"/>
+        </w:rPr>
+        <w:t>snapshot</w:t>
+      </w:r>
+      <w:r>
+        <w:rPr>
+          <w:lang w:val="id-ID"/>
+        </w:rPr>
+        <w:t xml:space="preserve"> ini, 508 record capaian SPAM dan data pekerjaan aktif telah terhimpun. Capaian Standar Pelayanan Minimum (SPM) air minum 13,24% dan sanitasi 1,90% akan terus diperbarui seiring sinkronisasi. Catatan penting: seluruh angka dalam dokumen ini bersumber dari data yang telah dihimpun Arumanis dan masih dalam tahap sinkronisasi dari berbagai sumber. Proses harmonisasi belum selesai sepenuhnya sehingga dapat terdapat ketidaksesuaian, duplikasi, atau kesalahan data. Angka diposisikan sebagai gambaran kondisi terkini, bukan pernyataan final.</w:t>
       </w:r>
     </w:p>
     <w:p>
@@ -1530,7 +1832,7 @@
         <w:rPr>
           <w:lang w:val="id-ID"/>
         </w:rPr>
-        <w:t>2.2  Keunggulan Inovasi</w:t>
+        <w:t>2.2  Keunggulan</w:t>
       </w:r>
     </w:p>
     <w:p>
@@ -1572,7 +1874,21 @@
         <w:rPr>
           <w:lang w:val="id-ID"/>
         </w:rPr>
-        <w:t xml:space="preserve">Arumanis juga unggul dalam pengolahan data real-time: dashboard, peta </w:t>
+        <w:t xml:space="preserve">Arumanis juga unggul dalam pengolahan data real-time: </w:t>
+      </w:r>
+      <w:r>
+        <w:rPr>
+          <w:i/>
+          <w:iCs/>
+          <w:lang w:val="id-ID"/>
+        </w:rPr>
+        <w:t>dashboard</w:t>
+      </w:r>
+      <w:r>
+        <w:rPr>
+          <w:lang w:val="id-ID"/>
+        </w:rPr>
+        <w:t xml:space="preserve">, peta </w:t>
       </w:r>
       <w:r>
         <w:rPr>
@@ -1591,7 +1907,19 @@
           <w:lang w:val="id-ID"/>
         </w:rPr>
         <w:lastRenderedPageBreak/>
-        <w:t>Pengawas tidak perlu aplikasi terpisah; foto progres, laporan mingguan, dan tiket kendala tercatat dalam sistem yang sama dengan data kantor pusat.</w:t>
+        <w:t xml:space="preserve">Pengawas tidak perlu aplikasi terpisah; foto progres, laporan mingguan, dan tiket kendala tercatat dalam sistem yang sama dengan data </w:t>
+      </w:r>
+      <w:r>
+        <w:rPr>
+          <w:lang w:val="id-ID"/>
+        </w:rPr>
+        <w:t>terpusat</w:t>
+      </w:r>
+      <w:r>
+        <w:rPr>
+          <w:lang w:val="id-ID"/>
+        </w:rPr>
+        <w:t>.</w:t>
       </w:r>
     </w:p>
     <w:p>
@@ -1659,7 +1987,7 @@
         <w:rPr>
           <w:lang w:val="id-ID"/>
         </w:rPr>
-        <w:t>2.3  Ketersediaan SDM Pengelola Inovasi Daerah</w:t>
+        <w:t>2.3  Ketersediaan SDM</w:t>
       </w:r>
     </w:p>
     <w:p>
@@ -1698,7 +2026,7 @@
         <w:rPr>
           <w:lang w:val="id-ID"/>
         </w:rPr>
-        <w:t xml:space="preserve"> SPAM dan sanitasi, tim pengembang sistem yang mengelola platform dan proses sinkronisasi data, serta jaringan pengawas lapangan.</w:t>
+        <w:t xml:space="preserve"> SPAM dan sanitasi, pengembang sistem yang mengelola platform dan proses sinkronisasi data, serta jaringan pengawas lapangan.</w:t>
       </w:r>
     </w:p>
     <w:p>
@@ -1793,7 +2121,35 @@
         <w:rPr>
           <w:lang w:val="id-ID"/>
         </w:rPr>
-        <w:t>, template impor CSV/Excel, dan audit log perubahan.</w:t>
+        <w:t xml:space="preserve">, template impor </w:t>
+      </w:r>
+      <w:r>
+        <w:rPr>
+          <w:i/>
+          <w:iCs/>
+          <w:lang w:val="id-ID"/>
+        </w:rPr>
+        <w:t>CSV/Excel</w:t>
+      </w:r>
+      <w:r>
+        <w:rPr>
+          <w:lang w:val="id-ID"/>
+        </w:rPr>
+        <w:t xml:space="preserve">, dan </w:t>
+      </w:r>
+      <w:r>
+        <w:rPr>
+          <w:i/>
+          <w:iCs/>
+          <w:lang w:val="id-ID"/>
+        </w:rPr>
+        <w:t>audit log</w:t>
+      </w:r>
+      <w:r>
+        <w:rPr>
+          <w:lang w:val="id-ID"/>
+        </w:rPr>
+        <w:t xml:space="preserve"> perubahan.</w:t>
       </w:r>
     </w:p>
     <w:p>
@@ -1888,7 +2244,19 @@
         <w:rPr>
           <w:lang w:val="id-ID"/>
         </w:rPr>
-        <w:t xml:space="preserve"> dari arsip eksternal. (2) Menautkan pekerjaan konstruksi ke unit SPAM dan infrastruktur sanitasi secara menyeluruh. (3) Memperluas integrasi SIMSPAM dari 33 unit saat ini. (4) Meningkatkan kelengkapan metadata GPS/foto menuju target 90% paket aktif. (5) Memperkaya data capaian sanitasi di 261 desa yang belum berinfrastruktur terpetakan.</w:t>
+        <w:t xml:space="preserve"> dari arsip eksternal. (2) Menautkan pekerjaan konstruksi ke unit SPAM dan infrastruktur sanitasi secara menyeluruh. (3) Memperluas integrasi SIMSPAM dari 33 unit saat ini. (4) Meningkatkan kelengkapan metadata</w:t>
+      </w:r>
+      <w:r>
+        <w:rPr>
+          <w:lang w:val="id-ID"/>
+        </w:rPr>
+        <w:t xml:space="preserve"> atau tagging</w:t>
+      </w:r>
+      <w:r>
+        <w:rPr>
+          <w:lang w:val="id-ID"/>
+        </w:rPr>
+        <w:t xml:space="preserve"> GPS/foto menuju target 90% paket aktif. (5) Memperkaya data capaian sanitasi di 261 desa yang belum berinfrastruktur terpetakan.</w:t>
       </w:r>
     </w:p>
     <w:p>
@@ -1904,7 +2272,7 @@
           <w:lang w:val="id-ID"/>
         </w:rPr>
         <w:lastRenderedPageBreak/>
-        <w:t>BAB III  TUJUAN INOVASI</w:t>
+        <w:t>BAB III  TUJUAN</w:t>
       </w:r>
     </w:p>
     <w:p>
@@ -1919,7 +2287,7 @@
         <w:rPr>
           <w:lang w:val="id-ID"/>
         </w:rPr>
-        <w:t>3.1  Target Capaian Penyelenggaraan Inovasi Daerah</w:t>
+        <w:t>3.1  Target Capaian Penyelenggaraan</w:t>
       </w:r>
     </w:p>
     <w:p>
@@ -1991,7 +2359,7 @@
         <w:rPr>
           <w:lang w:val="id-ID"/>
         </w:rPr>
-        <w:t>BAB IV  MANFAAT INOVASI</w:t>
+        <w:t>BAB IV  MANFAAT</w:t>
       </w:r>
     </w:p>
     <w:p>
@@ -2006,7 +2374,7 @@
         <w:rPr>
           <w:lang w:val="id-ID"/>
         </w:rPr>
-        <w:t>4.1  Manfaat yang Diperoleh dari Penerapan Inovasi Daerah</w:t>
+        <w:t>4.1  Manfaat yang Diperoleh</w:t>
       </w:r>
     </w:p>
     <w:p>
@@ -2441,7 +2809,7 @@
         <w:rPr>
           <w:lang w:val="id-ID"/>
         </w:rPr>
-        <w:t>BAB V  HASIL INOVASI</w:t>
+        <w:t>BAB V  HASIL</w:t>
       </w:r>
     </w:p>
     <w:p>
@@ -2485,7 +2853,21 @@
         <w:rPr>
           <w:lang w:val="id-ID"/>
         </w:rPr>
-        <w:t xml:space="preserve">) meliputi dashboard monitoring pekerjaan, modul kegiatan dan kontrak, SPAM Unit, indikator kualitas data, </w:t>
+        <w:t xml:space="preserve">) meliputi </w:t>
+      </w:r>
+      <w:r>
+        <w:rPr>
+          <w:i/>
+          <w:iCs/>
+          <w:lang w:val="id-ID"/>
+        </w:rPr>
+        <w:t>dashboard</w:t>
+      </w:r>
+      <w:r>
+        <w:rPr>
+          <w:lang w:val="id-ID"/>
+        </w:rPr>
+        <w:t xml:space="preserve"> monitoring pekerjaan, modul kegiatan dan kontrak, SPAM Unit, indikator kualitas data, </w:t>
       </w:r>
       <w:r>
         <w:rPr>
@@ -2550,7 +2932,33 @@
         <w:rPr>
           <w:lang w:val="id-ID"/>
         </w:rPr>
-        <w:t xml:space="preserve">Backend api amis (apiamis.cianjur.space) menjadi pusat penyimpanan dan validasi data. Puspen tersedia sebagai alat tambahan (arsip PDF, TTD digital, progress fisik, media sharing, statistik pengawas) untuk keperluan operasional pendukung. Halaman publik menampilkan peta capaian SPM dan sanitasi per desa. Basis data terintegrasi memuat 558 pekerjaan, 364 unit SPAM, 162 infrastruktur sanitasi, 6.168 foto, dan 508 record capaian (2009–2026)—sinkronisasi data </w:t>
+        <w:t>Backend api amis (apiamis.cianjur.space) menjadi pusat penyimpanan dan validasi data. Puspen tersedia sebagai alat tambahan (arsip PDF, TTD digital, progress fisik</w:t>
+      </w:r>
+      <w:r>
+        <w:rPr>
+          <w:lang w:val="id-ID"/>
+        </w:rPr>
+        <w:t xml:space="preserve"> review</w:t>
+      </w:r>
+      <w:r>
+        <w:rPr>
+          <w:lang w:val="id-ID"/>
+        </w:rPr>
+        <w:t xml:space="preserve">, media </w:t>
+      </w:r>
+      <w:r>
+        <w:rPr>
+          <w:i/>
+          <w:iCs/>
+          <w:lang w:val="id-ID"/>
+        </w:rPr>
+        <w:t>sharing</w:t>
+      </w:r>
+      <w:r>
+        <w:rPr>
+          <w:lang w:val="id-ID"/>
+        </w:rPr>
+        <w:t xml:space="preserve">, statistik pengawas) untuk keperluan operasional pendukung. Halaman publik menampilkan peta capaian SPM dan sanitasi per desa. Basis data terintegrasi memuat 558 pekerjaan, 364 unit SPAM, 162 infrastruktur sanitasi, 6.168 foto, dan 508 record capaian (2009–2026)—sinkronisasi data </w:t>
       </w:r>
       <w:r>
         <w:rPr>
@@ -2725,78 +3133,6 @@
             <wp:extent cx="4953000" cy="2771775"/>
             <wp:effectExtent l="0" t="0" r="0" b="0"/>
             <wp:docPr id="1" name="Gambar 1. Dashboard monitoring pekerjaan konstruksi air minum dan sanitasi (arumanis.cianjur.space)." descr="Gambar 1. Dashboard monitoring pekerjaan konstruksi air minum dan sanitasi (arumanis.cianjur.space)." title="Gambar 1. Dashboard monitoring pekerjaan konstruksi air minum dan sanitasi (arumanis.cianjur.space)."/>
-            <wp:cNvGraphicFramePr>
-              <a:graphicFrameLocks xmlns:a="http://schemas.openxmlformats.org/drawingml/2006/main" noChangeAspect="1"/>
-            </wp:cNvGraphicFramePr>
-            <a:graphic xmlns:a="http://schemas.openxmlformats.org/drawingml/2006/main">
-              <a:graphicData uri="http://schemas.openxmlformats.org/drawingml/2006/picture">
-                <pic:pic xmlns:pic="http://schemas.openxmlformats.org/drawingml/2006/picture">
-                  <pic:nvPicPr>
-                    <pic:cNvPr id="0" name=""/>
-                    <pic:cNvPicPr>
-                      <a:picLocks noChangeAspect="1" noChangeArrowheads="1"/>
-                    </pic:cNvPicPr>
-                  </pic:nvPicPr>
-                  <pic:blipFill>
-                    <a:blip r:embed="rId8"/>
-                    <a:srcRect/>
-                    <a:stretch>
-                      <a:fillRect/>
-                    </a:stretch>
-                  </pic:blipFill>
-                  <pic:spPr bwMode="auto">
-                    <a:xfrm>
-                      <a:off x="0" y="0"/>
-                      <a:ext cx="4953000" cy="2771775"/>
-                    </a:xfrm>
-                    <a:prstGeom prst="rect">
-                      <a:avLst/>
-                    </a:prstGeom>
-                  </pic:spPr>
-                </pic:pic>
-              </a:graphicData>
-            </a:graphic>
-          </wp:inline>
-        </w:drawing>
-      </w:r>
-    </w:p>
-    <w:p>
-      <w:pPr>
-        <w:spacing w:after="240"/>
-        <w:jc w:val="both"/>
-        <w:rPr>
-          <w:lang w:val="id-ID"/>
-        </w:rPr>
-      </w:pPr>
-      <w:r>
-        <w:rPr>
-          <w:i/>
-          <w:iCs/>
-          <w:sz w:val="20"/>
-          <w:szCs w:val="20"/>
-          <w:lang w:val="id-ID"/>
-        </w:rPr>
-        <w:t>Gambar 1. Dashboard monitoring pekerjaan konstruksi air minum dan sanitasi (arumanis.cianjur.space).</w:t>
-      </w:r>
-    </w:p>
-    <w:p>
-      <w:pPr>
-        <w:spacing w:before="120" w:after="80"/>
-        <w:jc w:val="both"/>
-        <w:rPr>
-          <w:lang w:val="id-ID"/>
-        </w:rPr>
-      </w:pPr>
-      <w:r>
-        <w:rPr>
-          <w:noProof/>
-          <w:lang w:val="id-ID"/>
-        </w:rPr>
-        <w:drawing>
-          <wp:inline distT="0" distB="0" distL="0" distR="0" wp14:anchorId="76BCC1A1" wp14:editId="425D2CD5">
-            <wp:extent cx="4953000" cy="2771775"/>
-            <wp:effectExtent l="0" t="0" r="0" b="0"/>
-            <wp:docPr id="1805719409" name="Gambar 2. Peta capaian Standar Pelayanan Minimum (SPM) air minum per desa." descr="Gambar 2. Peta capaian Standar Pelayanan Minimum (SPM) air minum per desa." title="Gambar 2. Peta capaian Standar Pelayanan Minimum (SPM) air minum per desa."/>
             <wp:cNvGraphicFramePr>
               <a:graphicFrameLocks xmlns:a="http://schemas.openxmlformats.org/drawingml/2006/main" noChangeAspect="1"/>
             </wp:cNvGraphicFramePr>
@@ -2848,8 +3184,7 @@
           <w:szCs w:val="20"/>
           <w:lang w:val="id-ID"/>
         </w:rPr>
-        <w:lastRenderedPageBreak/>
-        <w:t>Gambar 2. Peta capaian Standar Pelayanan Minimum (SPM) air minum per desa.</w:t>
+        <w:t>Gambar 1. Dashboard monitoring pekerjaan konstruksi air minum dan sanitasi (arumanis.cianjur.space).</w:t>
       </w:r>
     </w:p>
     <w:p>
@@ -2866,10 +3201,10 @@
           <w:lang w:val="id-ID"/>
         </w:rPr>
         <w:drawing>
-          <wp:inline distT="0" distB="0" distL="0" distR="0" wp14:anchorId="0B8DBE39" wp14:editId="57C75830">
+          <wp:inline distT="0" distB="0" distL="0" distR="0" wp14:anchorId="76BCC1A1" wp14:editId="425D2CD5">
             <wp:extent cx="4953000" cy="2771775"/>
             <wp:effectExtent l="0" t="0" r="0" b="0"/>
-            <wp:docPr id="115513189" name="Gambar 3. Peta capaian SPM sanitasi dan air limbah per desa." descr="Gambar 3. Peta capaian SPM sanitasi dan air limbah per desa." title="Gambar 3. Peta capaian SPM sanitasi dan air limbah per desa."/>
+            <wp:docPr id="1805719409" name="Gambar 2. Peta capaian Standar Pelayanan Minimum (SPM) air minum per desa." descr="Gambar 2. Peta capaian Standar Pelayanan Minimum (SPM) air minum per desa." title="Gambar 2. Peta capaian Standar Pelayanan Minimum (SPM) air minum per desa."/>
             <wp:cNvGraphicFramePr>
               <a:graphicFrameLocks xmlns:a="http://schemas.openxmlformats.org/drawingml/2006/main" noChangeAspect="1"/>
             </wp:cNvGraphicFramePr>
@@ -2921,7 +3256,8 @@
           <w:szCs w:val="20"/>
           <w:lang w:val="id-ID"/>
         </w:rPr>
-        <w:t>Gambar 3. Peta capaian SPM sanitasi dan air limbah per desa.</w:t>
+        <w:lastRenderedPageBreak/>
+        <w:t>Gambar 2. Peta capaian Standar Pelayanan Minimum (SPM) air minum per desa.</w:t>
       </w:r>
     </w:p>
     <w:p>
@@ -2938,10 +3274,10 @@
           <w:lang w:val="id-ID"/>
         </w:rPr>
         <w:drawing>
-          <wp:inline distT="0" distB="0" distL="0" distR="0" wp14:anchorId="158F0E38" wp14:editId="2C213996">
+          <wp:inline distT="0" distB="0" distL="0" distR="0" wp14:anchorId="0B8DBE39" wp14:editId="57C75830">
             <wp:extent cx="4953000" cy="2771775"/>
             <wp:effectExtent l="0" t="0" r="0" b="0"/>
-            <wp:docPr id="1558093199" name="Gambar 4. Panel Pengawasan terintegrasi untuk input progress dan dokumentasi lapangan." descr="Gambar 4. Panel Pengawasan terintegrasi untuk input progress dan dokumentasi lapangan." title="Gambar 4. Panel Pengawasan terintegrasi untuk input progress dan dokumentasi lapangan."/>
+            <wp:docPr id="115513189" name="Gambar 3. Peta capaian SPM sanitasi dan air limbah per desa." descr="Gambar 3. Peta capaian SPM sanitasi dan air limbah per desa." title="Gambar 3. Peta capaian SPM sanitasi dan air limbah per desa."/>
             <wp:cNvGraphicFramePr>
               <a:graphicFrameLocks xmlns:a="http://schemas.openxmlformats.org/drawingml/2006/main" noChangeAspect="1"/>
             </wp:cNvGraphicFramePr>
@@ -2993,6 +3329,78 @@
           <w:szCs w:val="20"/>
           <w:lang w:val="id-ID"/>
         </w:rPr>
+        <w:t>Gambar 3. Peta capaian SPM sanitasi dan air limbah per desa.</w:t>
+      </w:r>
+    </w:p>
+    <w:p>
+      <w:pPr>
+        <w:spacing w:before="120" w:after="80"/>
+        <w:jc w:val="both"/>
+        <w:rPr>
+          <w:lang w:val="id-ID"/>
+        </w:rPr>
+      </w:pPr>
+      <w:r>
+        <w:rPr>
+          <w:noProof/>
+          <w:lang w:val="id-ID"/>
+        </w:rPr>
+        <w:drawing>
+          <wp:inline distT="0" distB="0" distL="0" distR="0" wp14:anchorId="158F0E38" wp14:editId="2C213996">
+            <wp:extent cx="4953000" cy="2771775"/>
+            <wp:effectExtent l="0" t="0" r="0" b="0"/>
+            <wp:docPr id="1558093199" name="Gambar 4. Panel Pengawasan terintegrasi untuk input progress dan dokumentasi lapangan." descr="Gambar 4. Panel Pengawasan terintegrasi untuk input progress dan dokumentasi lapangan." title="Gambar 4. Panel Pengawasan terintegrasi untuk input progress dan dokumentasi lapangan."/>
+            <wp:cNvGraphicFramePr>
+              <a:graphicFrameLocks xmlns:a="http://schemas.openxmlformats.org/drawingml/2006/main" noChangeAspect="1"/>
+            </wp:cNvGraphicFramePr>
+            <a:graphic xmlns:a="http://schemas.openxmlformats.org/drawingml/2006/main">
+              <a:graphicData uri="http://schemas.openxmlformats.org/drawingml/2006/picture">
+                <pic:pic xmlns:pic="http://schemas.openxmlformats.org/drawingml/2006/picture">
+                  <pic:nvPicPr>
+                    <pic:cNvPr id="0" name=""/>
+                    <pic:cNvPicPr>
+                      <a:picLocks noChangeAspect="1" noChangeArrowheads="1"/>
+                    </pic:cNvPicPr>
+                  </pic:nvPicPr>
+                  <pic:blipFill>
+                    <a:blip r:embed="rId12"/>
+                    <a:srcRect/>
+                    <a:stretch>
+                      <a:fillRect/>
+                    </a:stretch>
+                  </pic:blipFill>
+                  <pic:spPr bwMode="auto">
+                    <a:xfrm>
+                      <a:off x="0" y="0"/>
+                      <a:ext cx="4953000" cy="2771775"/>
+                    </a:xfrm>
+                    <a:prstGeom prst="rect">
+                      <a:avLst/>
+                    </a:prstGeom>
+                  </pic:spPr>
+                </pic:pic>
+              </a:graphicData>
+            </a:graphic>
+          </wp:inline>
+        </w:drawing>
+      </w:r>
+    </w:p>
+    <w:p>
+      <w:pPr>
+        <w:spacing w:after="240"/>
+        <w:jc w:val="both"/>
+        <w:rPr>
+          <w:lang w:val="id-ID"/>
+        </w:rPr>
+      </w:pPr>
+      <w:r>
+        <w:rPr>
+          <w:i/>
+          <w:iCs/>
+          <w:sz w:val="20"/>
+          <w:szCs w:val="20"/>
+          <w:lang w:val="id-ID"/>
+        </w:rPr>
         <w:t>Gambar 4. Panel Pengawasan terintegrasi untuk input progress dan dokumentasi lapangan.</w:t>
       </w:r>
     </w:p>
@@ -3014,7 +3422,7 @@
       </w:r>
     </w:p>
     <w:sectPr>
-      <w:footerReference w:type="default" r:id="rId12"/>
+      <w:footerReference w:type="default" r:id="rId13"/>
       <w:pgSz w:w="11906" w:h="16838"/>
       <w:pgMar w:top="1440" w:right="1440" w:bottom="1440" w:left="1440" w:header="708" w:footer="708" w:gutter="0"/>
       <w:cols w:space="720"/>
@@ -3054,7 +3462,39 @@
         <w:sz w:val="18"/>
         <w:szCs w:val="18"/>
       </w:rPr>
-      <w:t xml:space="preserve">Proposal Inovasi Arumanis — Halaman </w:t>
+      <w:t xml:space="preserve">Proposal </w:t>
+    </w:r>
+    <w:proofErr w:type="spellStart"/>
+    <w:r>
+      <w:rPr>
+        <w:sz w:val="18"/>
+        <w:szCs w:val="18"/>
+      </w:rPr>
+      <w:t>Inovasi</w:t>
+    </w:r>
+    <w:proofErr w:type="spellEnd"/>
+    <w:r>
+      <w:rPr>
+        <w:sz w:val="18"/>
+        <w:szCs w:val="18"/>
+      </w:rPr>
+      <w:t xml:space="preserve"> </w:t>
+    </w:r>
+    <w:proofErr w:type="spellStart"/>
+    <w:r>
+      <w:rPr>
+        <w:sz w:val="18"/>
+        <w:szCs w:val="18"/>
+      </w:rPr>
+      <w:t>Arumanis</w:t>
+    </w:r>
+    <w:proofErr w:type="spellEnd"/>
+    <w:r>
+      <w:rPr>
+        <w:sz w:val="18"/>
+        <w:szCs w:val="18"/>
+      </w:rPr>
+      <w:t xml:space="preserve"> — Halaman </w:t>
     </w:r>
     <w:r>
       <w:rPr>
@@ -3856,6 +4296,18 @@
     <w:uiPriority w:val="99"/>
     <w:rsid w:val="006F35A4"/>
   </w:style>
+  <w:style w:type="character" w:styleId="UnresolvedMention">
+    <w:name w:val="Unresolved Mention"/>
+    <w:basedOn w:val="DefaultParagraphFont"/>
+    <w:uiPriority w:val="99"/>
+    <w:semiHidden/>
+    <w:unhideWhenUsed/>
+    <w:rsid w:val="006D41DD"/>
+    <w:rPr>
+      <w:color w:val="605E5C"/>
+      <w:shd w:val="clear" w:color="auto" w:fill="E1DFDD"/>
+    </w:rPr>
+  </w:style>
 </w:styles>
 </file>
 

</xml_diff>